<commit_message>
rwml 0.1.1: rendering fidelity and release hardening
</commit_message>
<xml_diff>
--- a/corpus/public/synthetic/kitchen_sink.docx
+++ b/corpus/public/synthetic/kitchen_sink.docx
@@ -3,12 +3,12 @@
 <w:document xmlns:w="http://schemas.openxmlformats.org/wordprocessingml/2006/main" xmlns:r="http://schemas.openxmlformats.org/officeDocument/2006/relationships" xmlns:mc="http://schemas.openxmlformats.org/markup-compatibility/2006" xmlns:wps="http://schemas.microsoft.com/office/word/2010/wordprocessingShape" xmlns:wp="http://schemas.openxmlformats.org/drawingml/2006/wordprocessingDrawing" xmlns:a="http://schemas.openxmlformats.org/drawingml/2006/main" xmlns:pic="http://schemas.openxmlformats.org/drawingml/2006/picture" xmlns:v="urn:schemas-microsoft-com:vml" mc:Ignorable="wps wp a pic">
   <w:body>
     <w:p>
-      <w:ins w:id="1" w:author="rdoc" w:date="2020-01-01T00:00:00Z">
+      <w:ins w:id="1" w:author="rwml" w:date="2020-01-01T00:00:00Z">
         <w:r>
           <w:t>INSERTED </w:t>
         </w:r>
       </w:ins>
-      <w:del w:id="2" w:author="rdoc" w:date="2020-01-01T00:00:00Z">
+      <w:del w:id="2" w:author="rwml" w:date="2020-01-01T00:00:00Z">
         <w:r>
           <w:delText>DELETED</w:delText>
         </w:r>
@@ -152,7 +152,7 @@
 
 <file path=word/comments.xml><?xml version="1.0" encoding="utf-8"?>
 <w:comments xmlns:w="http://schemas.openxmlformats.org/wordprocessingml/2006/main">
-  <w:comment w:id="0" w:author="rdoc" w:date="2020-01-01T00:00:00Z" w:initials="r">
+  <w:comment w:id="0" w:author="rwml" w:date="2020-01-01T00:00:00Z" w:initials="r">
     <w:p>
       <w:r>
         <w:t>A comment.</w:t>

</xml_diff>